<commit_message>
# update rev comments
</commit_message>
<xml_diff>
--- a/output tables/model_summary_2018-2024_Crow.docx
+++ b/output tables/model_summary_2018-2024_Crow.docx
@@ -394,7 +394,7 @@
                 <w:szCs w:val="22"/>
                 <w:color w:val="000000"/>
               </w:rPr>
-              <w:t xml:space="preserve">3.83</w:t>
+              <w:t xml:space="preserve">3.86</w:t>
             </w:r>
           </w:p>
         </w:tc>
@@ -447,7 +447,7 @@
                 <w:szCs w:val="22"/>
                 <w:color w:val="000000"/>
               </w:rPr>
-              <w:t xml:space="preserve">3.64</w:t>
+              <w:t xml:space="preserve">3.66</w:t>
             </w:r>
           </w:p>
         </w:tc>
@@ -500,7 +500,7 @@
                 <w:szCs w:val="22"/>
                 <w:color w:val="000000"/>
               </w:rPr>
-              <w:t xml:space="preserve">4.03</w:t>
+              <w:t xml:space="preserve">4.07</w:t>
             </w:r>
           </w:p>
         </w:tc>
@@ -1531,7 +1531,7 @@
                 <w:szCs w:val="22"/>
                 <w:color w:val="000000"/>
               </w:rPr>
-              <w:t xml:space="preserve">-0.49</w:t>
+              <w:t xml:space="preserve">-0.50</w:t>
             </w:r>
           </w:p>
         </w:tc>
@@ -1749,113 +1749,113 @@
                 <w:szCs w:val="22"/>
                 <w:color w:val="000000"/>
               </w:rPr>
-              <w:t xml:space="preserve">-0.67</w:t>
-            </w:r>
-          </w:p>
-        </w:tc>
-        <w:tc>
-          <w:tcPr>
-            <w:tcBorders>
-              <w:bottom w:val="none" w:sz="0" w:space="0" w:color="000000"/>
-              <w:top w:val="none" w:sz="0" w:space="0" w:color="000000"/>
-              <w:left w:val="none" w:sz="0" w:space="0" w:color="000000"/>
-              <w:right w:val="none" w:sz="0" w:space="0" w:color="000000"/>
-            </w:tcBorders>
-            <w:shd w:val="clear" w:color="auto" w:fill="FFFFFF"/>
-            <w:tcMar>
-              <w:top w:w="0" w:type="dxa"/>
-              <w:bottom w:w="0" w:type="dxa"/>
-              <w:left w:w="0" w:type="dxa"/>
-              <w:right w:w="0" w:type="dxa"/>
-            </w:tcMar>
-            <w:vAlign w:val="center"/>
-          </w:tcPr>
-          <w:p>
-            <w:pPr>
-              <w:pStyle w:val="Normal"/>
-              <w:jc w:val="right"/>
-              <w:pBdr>
-                <w:bottom w:val="none" w:sz="0" w:space="0" w:color="000000"/>
-                <w:top w:val="none" w:sz="0" w:space="0" w:color="000000"/>
-                <w:left w:val="none" w:sz="0" w:space="0" w:color="000000"/>
-                <w:right w:val="none" w:sz="0" w:space="0" w:color="000000"/>
-              </w:pBdr>
-              <w:spacing w:after="100" w:before="100" w:line="240"/>
-              <w:ind w:left="100" w:right="100" w:firstLine="0" w:firstLineChars="0"/>
-              <w:rPr>
-                <w:rFonts w:ascii="Arial" w:hAnsi="Arial" w:eastAsia="Arial" w:cs="Arial"/>
-                <w:i w:val="false"/>
-                <w:b w:val="false"/>
-                <w:u w:val="none"/>
-                <w:sz w:val="22"/>
-                <w:szCs w:val="22"/>
-                <w:color w:val="000000"/>
-              </w:rPr>
-            </w:pPr>
-            <w:r>
-              <w:rPr>
-                <w:rFonts w:ascii="Arial" w:hAnsi="Arial" w:eastAsia="Arial" w:cs="Arial"/>
-                <w:i w:val="false"/>
-                <w:b w:val="false"/>
-                <w:u w:val="none"/>
-                <w:sz w:val="22"/>
-                <w:szCs w:val="22"/>
-                <w:color w:val="000000"/>
-              </w:rPr>
-              <w:t xml:space="preserve">-0.92</w:t>
-            </w:r>
-          </w:p>
-        </w:tc>
-        <w:tc>
-          <w:tcPr>
-            <w:tcBorders>
-              <w:bottom w:val="none" w:sz="0" w:space="0" w:color="000000"/>
-              <w:top w:val="none" w:sz="0" w:space="0" w:color="000000"/>
-              <w:left w:val="none" w:sz="0" w:space="0" w:color="000000"/>
-              <w:right w:val="none" w:sz="0" w:space="0" w:color="000000"/>
-            </w:tcBorders>
-            <w:shd w:val="clear" w:color="auto" w:fill="FFFFFF"/>
-            <w:tcMar>
-              <w:top w:w="0" w:type="dxa"/>
-              <w:bottom w:w="0" w:type="dxa"/>
-              <w:left w:w="0" w:type="dxa"/>
-              <w:right w:w="0" w:type="dxa"/>
-            </w:tcMar>
-            <w:vAlign w:val="center"/>
-          </w:tcPr>
-          <w:p>
-            <w:pPr>
-              <w:pStyle w:val="Normal"/>
-              <w:jc w:val="right"/>
-              <w:pBdr>
-                <w:bottom w:val="none" w:sz="0" w:space="0" w:color="000000"/>
-                <w:top w:val="none" w:sz="0" w:space="0" w:color="000000"/>
-                <w:left w:val="none" w:sz="0" w:space="0" w:color="000000"/>
-                <w:right w:val="none" w:sz="0" w:space="0" w:color="000000"/>
-              </w:pBdr>
-              <w:spacing w:after="100" w:before="100" w:line="240"/>
-              <w:ind w:left="100" w:right="100" w:firstLine="0" w:firstLineChars="0"/>
-              <w:rPr>
-                <w:rFonts w:ascii="Arial" w:hAnsi="Arial" w:eastAsia="Arial" w:cs="Arial"/>
-                <w:i w:val="false"/>
-                <w:b w:val="false"/>
-                <w:u w:val="none"/>
-                <w:sz w:val="22"/>
-                <w:szCs w:val="22"/>
-                <w:color w:val="000000"/>
-              </w:rPr>
-            </w:pPr>
-            <w:r>
-              <w:rPr>
-                <w:rFonts w:ascii="Arial" w:hAnsi="Arial" w:eastAsia="Arial" w:cs="Arial"/>
-                <w:i w:val="false"/>
-                <w:b w:val="false"/>
-                <w:u w:val="none"/>
-                <w:sz w:val="22"/>
-                <w:szCs w:val="22"/>
-                <w:color w:val="000000"/>
-              </w:rPr>
-              <w:t xml:space="preserve">-0.41</w:t>
+              <w:t xml:space="preserve">-0.65</w:t>
+            </w:r>
+          </w:p>
+        </w:tc>
+        <w:tc>
+          <w:tcPr>
+            <w:tcBorders>
+              <w:bottom w:val="none" w:sz="0" w:space="0" w:color="000000"/>
+              <w:top w:val="none" w:sz="0" w:space="0" w:color="000000"/>
+              <w:left w:val="none" w:sz="0" w:space="0" w:color="000000"/>
+              <w:right w:val="none" w:sz="0" w:space="0" w:color="000000"/>
+            </w:tcBorders>
+            <w:shd w:val="clear" w:color="auto" w:fill="FFFFFF"/>
+            <w:tcMar>
+              <w:top w:w="0" w:type="dxa"/>
+              <w:bottom w:w="0" w:type="dxa"/>
+              <w:left w:w="0" w:type="dxa"/>
+              <w:right w:w="0" w:type="dxa"/>
+            </w:tcMar>
+            <w:vAlign w:val="center"/>
+          </w:tcPr>
+          <w:p>
+            <w:pPr>
+              <w:pStyle w:val="Normal"/>
+              <w:jc w:val="right"/>
+              <w:pBdr>
+                <w:bottom w:val="none" w:sz="0" w:space="0" w:color="000000"/>
+                <w:top w:val="none" w:sz="0" w:space="0" w:color="000000"/>
+                <w:left w:val="none" w:sz="0" w:space="0" w:color="000000"/>
+                <w:right w:val="none" w:sz="0" w:space="0" w:color="000000"/>
+              </w:pBdr>
+              <w:spacing w:after="100" w:before="100" w:line="240"/>
+              <w:ind w:left="100" w:right="100" w:firstLine="0" w:firstLineChars="0"/>
+              <w:rPr>
+                <w:rFonts w:ascii="Arial" w:hAnsi="Arial" w:eastAsia="Arial" w:cs="Arial"/>
+                <w:i w:val="false"/>
+                <w:b w:val="false"/>
+                <w:u w:val="none"/>
+                <w:sz w:val="22"/>
+                <w:szCs w:val="22"/>
+                <w:color w:val="000000"/>
+              </w:rPr>
+            </w:pPr>
+            <w:r>
+              <w:rPr>
+                <w:rFonts w:ascii="Arial" w:hAnsi="Arial" w:eastAsia="Arial" w:cs="Arial"/>
+                <w:i w:val="false"/>
+                <w:b w:val="false"/>
+                <w:u w:val="none"/>
+                <w:sz w:val="22"/>
+                <w:szCs w:val="22"/>
+                <w:color w:val="000000"/>
+              </w:rPr>
+              <w:t xml:space="preserve">-0.91</w:t>
+            </w:r>
+          </w:p>
+        </w:tc>
+        <w:tc>
+          <w:tcPr>
+            <w:tcBorders>
+              <w:bottom w:val="none" w:sz="0" w:space="0" w:color="000000"/>
+              <w:top w:val="none" w:sz="0" w:space="0" w:color="000000"/>
+              <w:left w:val="none" w:sz="0" w:space="0" w:color="000000"/>
+              <w:right w:val="none" w:sz="0" w:space="0" w:color="000000"/>
+            </w:tcBorders>
+            <w:shd w:val="clear" w:color="auto" w:fill="FFFFFF"/>
+            <w:tcMar>
+              <w:top w:w="0" w:type="dxa"/>
+              <w:bottom w:w="0" w:type="dxa"/>
+              <w:left w:w="0" w:type="dxa"/>
+              <w:right w:w="0" w:type="dxa"/>
+            </w:tcMar>
+            <w:vAlign w:val="center"/>
+          </w:tcPr>
+          <w:p>
+            <w:pPr>
+              <w:pStyle w:val="Normal"/>
+              <w:jc w:val="right"/>
+              <w:pBdr>
+                <w:bottom w:val="none" w:sz="0" w:space="0" w:color="000000"/>
+                <w:top w:val="none" w:sz="0" w:space="0" w:color="000000"/>
+                <w:left w:val="none" w:sz="0" w:space="0" w:color="000000"/>
+                <w:right w:val="none" w:sz="0" w:space="0" w:color="000000"/>
+              </w:pBdr>
+              <w:spacing w:after="100" w:before="100" w:line="240"/>
+              <w:ind w:left="100" w:right="100" w:firstLine="0" w:firstLineChars="0"/>
+              <w:rPr>
+                <w:rFonts w:ascii="Arial" w:hAnsi="Arial" w:eastAsia="Arial" w:cs="Arial"/>
+                <w:i w:val="false"/>
+                <w:b w:val="false"/>
+                <w:u w:val="none"/>
+                <w:sz w:val="22"/>
+                <w:szCs w:val="22"/>
+                <w:color w:val="000000"/>
+              </w:rPr>
+            </w:pPr>
+            <w:r>
+              <w:rPr>
+                <w:rFonts w:ascii="Arial" w:hAnsi="Arial" w:eastAsia="Arial" w:cs="Arial"/>
+                <w:i w:val="false"/>
+                <w:b w:val="false"/>
+                <w:u w:val="none"/>
+                <w:sz w:val="22"/>
+                <w:szCs w:val="22"/>
+                <w:color w:val="000000"/>
+              </w:rPr>
+              <w:t xml:space="preserve">-0.39</w:t>
             </w:r>
           </w:p>
         </w:tc>
@@ -2020,113 +2020,113 @@
                 <w:szCs w:val="22"/>
                 <w:color w:val="000000"/>
               </w:rPr>
-              <w:t xml:space="preserve">0.49</w:t>
-            </w:r>
-          </w:p>
-        </w:tc>
-        <w:tc>
-          <w:tcPr>
-            <w:tcBorders>
-              <w:bottom w:val="none" w:sz="0" w:space="0" w:color="000000"/>
-              <w:top w:val="none" w:sz="0" w:space="0" w:color="000000"/>
-              <w:left w:val="none" w:sz="0" w:space="0" w:color="000000"/>
-              <w:right w:val="none" w:sz="0" w:space="0" w:color="000000"/>
-            </w:tcBorders>
-            <w:shd w:val="clear" w:color="auto" w:fill="FFFFFF"/>
-            <w:tcMar>
-              <w:top w:w="0" w:type="dxa"/>
-              <w:bottom w:w="0" w:type="dxa"/>
-              <w:left w:w="0" w:type="dxa"/>
-              <w:right w:w="0" w:type="dxa"/>
-            </w:tcMar>
-            <w:vAlign w:val="center"/>
-          </w:tcPr>
-          <w:p>
-            <w:pPr>
-              <w:pStyle w:val="Normal"/>
-              <w:jc w:val="right"/>
-              <w:pBdr>
-                <w:bottom w:val="none" w:sz="0" w:space="0" w:color="000000"/>
-                <w:top w:val="none" w:sz="0" w:space="0" w:color="000000"/>
-                <w:left w:val="none" w:sz="0" w:space="0" w:color="000000"/>
-                <w:right w:val="none" w:sz="0" w:space="0" w:color="000000"/>
-              </w:pBdr>
-              <w:spacing w:after="100" w:before="100" w:line="240"/>
-              <w:ind w:left="100" w:right="100" w:firstLine="0" w:firstLineChars="0"/>
-              <w:rPr>
-                <w:rFonts w:ascii="Arial" w:hAnsi="Arial" w:eastAsia="Arial" w:cs="Arial"/>
-                <w:i w:val="false"/>
-                <w:b w:val="false"/>
-                <w:u w:val="none"/>
-                <w:sz w:val="22"/>
-                <w:szCs w:val="22"/>
-                <w:color w:val="000000"/>
-              </w:rPr>
-            </w:pPr>
-            <w:r>
-              <w:rPr>
-                <w:rFonts w:ascii="Arial" w:hAnsi="Arial" w:eastAsia="Arial" w:cs="Arial"/>
-                <w:i w:val="false"/>
-                <w:b w:val="false"/>
-                <w:u w:val="none"/>
-                <w:sz w:val="22"/>
-                <w:szCs w:val="22"/>
-                <w:color w:val="000000"/>
-              </w:rPr>
-              <w:t xml:space="preserve">0.24</w:t>
-            </w:r>
-          </w:p>
-        </w:tc>
-        <w:tc>
-          <w:tcPr>
-            <w:tcBorders>
-              <w:bottom w:val="none" w:sz="0" w:space="0" w:color="000000"/>
-              <w:top w:val="none" w:sz="0" w:space="0" w:color="000000"/>
-              <w:left w:val="none" w:sz="0" w:space="0" w:color="000000"/>
-              <w:right w:val="none" w:sz="0" w:space="0" w:color="000000"/>
-            </w:tcBorders>
-            <w:shd w:val="clear" w:color="auto" w:fill="FFFFFF"/>
-            <w:tcMar>
-              <w:top w:w="0" w:type="dxa"/>
-              <w:bottom w:w="0" w:type="dxa"/>
-              <w:left w:w="0" w:type="dxa"/>
-              <w:right w:w="0" w:type="dxa"/>
-            </w:tcMar>
-            <w:vAlign w:val="center"/>
-          </w:tcPr>
-          <w:p>
-            <w:pPr>
-              <w:pStyle w:val="Normal"/>
-              <w:jc w:val="right"/>
-              <w:pBdr>
-                <w:bottom w:val="none" w:sz="0" w:space="0" w:color="000000"/>
-                <w:top w:val="none" w:sz="0" w:space="0" w:color="000000"/>
-                <w:left w:val="none" w:sz="0" w:space="0" w:color="000000"/>
-                <w:right w:val="none" w:sz="0" w:space="0" w:color="000000"/>
-              </w:pBdr>
-              <w:spacing w:after="100" w:before="100" w:line="240"/>
-              <w:ind w:left="100" w:right="100" w:firstLine="0" w:firstLineChars="0"/>
-              <w:rPr>
-                <w:rFonts w:ascii="Arial" w:hAnsi="Arial" w:eastAsia="Arial" w:cs="Arial"/>
-                <w:i w:val="false"/>
-                <w:b w:val="false"/>
-                <w:u w:val="none"/>
-                <w:sz w:val="22"/>
-                <w:szCs w:val="22"/>
-                <w:color w:val="000000"/>
-              </w:rPr>
-            </w:pPr>
-            <w:r>
-              <w:rPr>
-                <w:rFonts w:ascii="Arial" w:hAnsi="Arial" w:eastAsia="Arial" w:cs="Arial"/>
-                <w:i w:val="false"/>
-                <w:b w:val="false"/>
-                <w:u w:val="none"/>
-                <w:sz w:val="22"/>
-                <w:szCs w:val="22"/>
-                <w:color w:val="000000"/>
-              </w:rPr>
-              <w:t xml:space="preserve">0.74</w:t>
+              <w:t xml:space="preserve">0.51</w:t>
+            </w:r>
+          </w:p>
+        </w:tc>
+        <w:tc>
+          <w:tcPr>
+            <w:tcBorders>
+              <w:bottom w:val="none" w:sz="0" w:space="0" w:color="000000"/>
+              <w:top w:val="none" w:sz="0" w:space="0" w:color="000000"/>
+              <w:left w:val="none" w:sz="0" w:space="0" w:color="000000"/>
+              <w:right w:val="none" w:sz="0" w:space="0" w:color="000000"/>
+            </w:tcBorders>
+            <w:shd w:val="clear" w:color="auto" w:fill="FFFFFF"/>
+            <w:tcMar>
+              <w:top w:w="0" w:type="dxa"/>
+              <w:bottom w:w="0" w:type="dxa"/>
+              <w:left w:w="0" w:type="dxa"/>
+              <w:right w:w="0" w:type="dxa"/>
+            </w:tcMar>
+            <w:vAlign w:val="center"/>
+          </w:tcPr>
+          <w:p>
+            <w:pPr>
+              <w:pStyle w:val="Normal"/>
+              <w:jc w:val="right"/>
+              <w:pBdr>
+                <w:bottom w:val="none" w:sz="0" w:space="0" w:color="000000"/>
+                <w:top w:val="none" w:sz="0" w:space="0" w:color="000000"/>
+                <w:left w:val="none" w:sz="0" w:space="0" w:color="000000"/>
+                <w:right w:val="none" w:sz="0" w:space="0" w:color="000000"/>
+              </w:pBdr>
+              <w:spacing w:after="100" w:before="100" w:line="240"/>
+              <w:ind w:left="100" w:right="100" w:firstLine="0" w:firstLineChars="0"/>
+              <w:rPr>
+                <w:rFonts w:ascii="Arial" w:hAnsi="Arial" w:eastAsia="Arial" w:cs="Arial"/>
+                <w:i w:val="false"/>
+                <w:b w:val="false"/>
+                <w:u w:val="none"/>
+                <w:sz w:val="22"/>
+                <w:szCs w:val="22"/>
+                <w:color w:val="000000"/>
+              </w:rPr>
+            </w:pPr>
+            <w:r>
+              <w:rPr>
+                <w:rFonts w:ascii="Arial" w:hAnsi="Arial" w:eastAsia="Arial" w:cs="Arial"/>
+                <w:i w:val="false"/>
+                <w:b w:val="false"/>
+                <w:u w:val="none"/>
+                <w:sz w:val="22"/>
+                <w:szCs w:val="22"/>
+                <w:color w:val="000000"/>
+              </w:rPr>
+              <w:t xml:space="preserve">0.25</w:t>
+            </w:r>
+          </w:p>
+        </w:tc>
+        <w:tc>
+          <w:tcPr>
+            <w:tcBorders>
+              <w:bottom w:val="none" w:sz="0" w:space="0" w:color="000000"/>
+              <w:top w:val="none" w:sz="0" w:space="0" w:color="000000"/>
+              <w:left w:val="none" w:sz="0" w:space="0" w:color="000000"/>
+              <w:right w:val="none" w:sz="0" w:space="0" w:color="000000"/>
+            </w:tcBorders>
+            <w:shd w:val="clear" w:color="auto" w:fill="FFFFFF"/>
+            <w:tcMar>
+              <w:top w:w="0" w:type="dxa"/>
+              <w:bottom w:w="0" w:type="dxa"/>
+              <w:left w:w="0" w:type="dxa"/>
+              <w:right w:w="0" w:type="dxa"/>
+            </w:tcMar>
+            <w:vAlign w:val="center"/>
+          </w:tcPr>
+          <w:p>
+            <w:pPr>
+              <w:pStyle w:val="Normal"/>
+              <w:jc w:val="right"/>
+              <w:pBdr>
+                <w:bottom w:val="none" w:sz="0" w:space="0" w:color="000000"/>
+                <w:top w:val="none" w:sz="0" w:space="0" w:color="000000"/>
+                <w:left w:val="none" w:sz="0" w:space="0" w:color="000000"/>
+                <w:right w:val="none" w:sz="0" w:space="0" w:color="000000"/>
+              </w:pBdr>
+              <w:spacing w:after="100" w:before="100" w:line="240"/>
+              <w:ind w:left="100" w:right="100" w:firstLine="0" w:firstLineChars="0"/>
+              <w:rPr>
+                <w:rFonts w:ascii="Arial" w:hAnsi="Arial" w:eastAsia="Arial" w:cs="Arial"/>
+                <w:i w:val="false"/>
+                <w:b w:val="false"/>
+                <w:u w:val="none"/>
+                <w:sz w:val="22"/>
+                <w:szCs w:val="22"/>
+                <w:color w:val="000000"/>
+              </w:rPr>
+            </w:pPr>
+            <w:r>
+              <w:rPr>
+                <w:rFonts w:ascii="Arial" w:hAnsi="Arial" w:eastAsia="Arial" w:cs="Arial"/>
+                <w:i w:val="false"/>
+                <w:b w:val="false"/>
+                <w:u w:val="none"/>
+                <w:sz w:val="22"/>
+                <w:szCs w:val="22"/>
+                <w:color w:val="000000"/>
+              </w:rPr>
+              <w:t xml:space="preserve">0.76</w:t>
             </w:r>
           </w:p>
         </w:tc>
@@ -2291,60 +2291,60 @@
                 <w:szCs w:val="22"/>
                 <w:color w:val="000000"/>
               </w:rPr>
-              <w:t xml:space="preserve">0.20</w:t>
-            </w:r>
-          </w:p>
-        </w:tc>
-        <w:tc>
-          <w:tcPr>
-            <w:tcBorders>
-              <w:bottom w:val="none" w:sz="0" w:space="0" w:color="000000"/>
-              <w:top w:val="none" w:sz="0" w:space="0" w:color="000000"/>
-              <w:left w:val="none" w:sz="0" w:space="0" w:color="000000"/>
-              <w:right w:val="none" w:sz="0" w:space="0" w:color="000000"/>
-            </w:tcBorders>
-            <w:shd w:val="clear" w:color="auto" w:fill="FFFFFF"/>
-            <w:tcMar>
-              <w:top w:w="0" w:type="dxa"/>
-              <w:bottom w:w="0" w:type="dxa"/>
-              <w:left w:w="0" w:type="dxa"/>
-              <w:right w:w="0" w:type="dxa"/>
-            </w:tcMar>
-            <w:vAlign w:val="center"/>
-          </w:tcPr>
-          <w:p>
-            <w:pPr>
-              <w:pStyle w:val="Normal"/>
-              <w:jc w:val="right"/>
-              <w:pBdr>
-                <w:bottom w:val="none" w:sz="0" w:space="0" w:color="000000"/>
-                <w:top w:val="none" w:sz="0" w:space="0" w:color="000000"/>
-                <w:left w:val="none" w:sz="0" w:space="0" w:color="000000"/>
-                <w:right w:val="none" w:sz="0" w:space="0" w:color="000000"/>
-              </w:pBdr>
-              <w:spacing w:after="100" w:before="100" w:line="240"/>
-              <w:ind w:left="100" w:right="100" w:firstLine="0" w:firstLineChars="0"/>
-              <w:rPr>
-                <w:rFonts w:ascii="Arial" w:hAnsi="Arial" w:eastAsia="Arial" w:cs="Arial"/>
-                <w:i w:val="false"/>
-                <w:b w:val="false"/>
-                <w:u w:val="none"/>
-                <w:sz w:val="22"/>
-                <w:szCs w:val="22"/>
-                <w:color w:val="000000"/>
-              </w:rPr>
-            </w:pPr>
-            <w:r>
-              <w:rPr>
-                <w:rFonts w:ascii="Arial" w:hAnsi="Arial" w:eastAsia="Arial" w:cs="Arial"/>
-                <w:i w:val="false"/>
-                <w:b w:val="false"/>
-                <w:u w:val="none"/>
-                <w:sz w:val="22"/>
-                <w:szCs w:val="22"/>
-                <w:color w:val="000000"/>
-              </w:rPr>
-              <w:t xml:space="preserve">0.12</w:t>
+              <w:t xml:space="preserve">0.21</w:t>
+            </w:r>
+          </w:p>
+        </w:tc>
+        <w:tc>
+          <w:tcPr>
+            <w:tcBorders>
+              <w:bottom w:val="none" w:sz="0" w:space="0" w:color="000000"/>
+              <w:top w:val="none" w:sz="0" w:space="0" w:color="000000"/>
+              <w:left w:val="none" w:sz="0" w:space="0" w:color="000000"/>
+              <w:right w:val="none" w:sz="0" w:space="0" w:color="000000"/>
+            </w:tcBorders>
+            <w:shd w:val="clear" w:color="auto" w:fill="FFFFFF"/>
+            <w:tcMar>
+              <w:top w:w="0" w:type="dxa"/>
+              <w:bottom w:w="0" w:type="dxa"/>
+              <w:left w:w="0" w:type="dxa"/>
+              <w:right w:w="0" w:type="dxa"/>
+            </w:tcMar>
+            <w:vAlign w:val="center"/>
+          </w:tcPr>
+          <w:p>
+            <w:pPr>
+              <w:pStyle w:val="Normal"/>
+              <w:jc w:val="right"/>
+              <w:pBdr>
+                <w:bottom w:val="none" w:sz="0" w:space="0" w:color="000000"/>
+                <w:top w:val="none" w:sz="0" w:space="0" w:color="000000"/>
+                <w:left w:val="none" w:sz="0" w:space="0" w:color="000000"/>
+                <w:right w:val="none" w:sz="0" w:space="0" w:color="000000"/>
+              </w:pBdr>
+              <w:spacing w:after="100" w:before="100" w:line="240"/>
+              <w:ind w:left="100" w:right="100" w:firstLine="0" w:firstLineChars="0"/>
+              <w:rPr>
+                <w:rFonts w:ascii="Arial" w:hAnsi="Arial" w:eastAsia="Arial" w:cs="Arial"/>
+                <w:i w:val="false"/>
+                <w:b w:val="false"/>
+                <w:u w:val="none"/>
+                <w:sz w:val="22"/>
+                <w:szCs w:val="22"/>
+                <w:color w:val="000000"/>
+              </w:rPr>
+            </w:pPr>
+            <w:r>
+              <w:rPr>
+                <w:rFonts w:ascii="Arial" w:hAnsi="Arial" w:eastAsia="Arial" w:cs="Arial"/>
+                <w:i w:val="false"/>
+                <w:b w:val="false"/>
+                <w:u w:val="none"/>
+                <w:sz w:val="22"/>
+                <w:szCs w:val="22"/>
+                <w:color w:val="000000"/>
+              </w:rPr>
+              <w:t xml:space="preserve">0.13</w:t>
             </w:r>
           </w:p>
         </w:tc>
@@ -2833,113 +2833,113 @@
                 <w:szCs w:val="22"/>
                 <w:color w:val="000000"/>
               </w:rPr>
-              <w:t xml:space="preserve">0.00</w:t>
-            </w:r>
-          </w:p>
-        </w:tc>
-        <w:tc>
-          <w:tcPr>
-            <w:tcBorders>
-              <w:bottom w:val="none" w:sz="0" w:space="0" w:color="000000"/>
-              <w:top w:val="none" w:sz="0" w:space="0" w:color="000000"/>
-              <w:left w:val="none" w:sz="0" w:space="0" w:color="000000"/>
-              <w:right w:val="none" w:sz="0" w:space="0" w:color="000000"/>
-            </w:tcBorders>
-            <w:shd w:val="clear" w:color="auto" w:fill="FFFFFF"/>
-            <w:tcMar>
-              <w:top w:w="0" w:type="dxa"/>
-              <w:bottom w:w="0" w:type="dxa"/>
-              <w:left w:w="0" w:type="dxa"/>
-              <w:right w:w="0" w:type="dxa"/>
-            </w:tcMar>
-            <w:vAlign w:val="center"/>
-          </w:tcPr>
-          <w:p>
-            <w:pPr>
-              <w:pStyle w:val="Normal"/>
-              <w:jc w:val="right"/>
-              <w:pBdr>
-                <w:bottom w:val="none" w:sz="0" w:space="0" w:color="000000"/>
-                <w:top w:val="none" w:sz="0" w:space="0" w:color="000000"/>
-                <w:left w:val="none" w:sz="0" w:space="0" w:color="000000"/>
-                <w:right w:val="none" w:sz="0" w:space="0" w:color="000000"/>
-              </w:pBdr>
-              <w:spacing w:after="100" w:before="100" w:line="240"/>
-              <w:ind w:left="100" w:right="100" w:firstLine="0" w:firstLineChars="0"/>
-              <w:rPr>
-                <w:rFonts w:ascii="Arial" w:hAnsi="Arial" w:eastAsia="Arial" w:cs="Arial"/>
-                <w:i w:val="false"/>
-                <w:b w:val="false"/>
-                <w:u w:val="none"/>
-                <w:sz w:val="22"/>
-                <w:szCs w:val="22"/>
-                <w:color w:val="000000"/>
-              </w:rPr>
-            </w:pPr>
-            <w:r>
-              <w:rPr>
-                <w:rFonts w:ascii="Arial" w:hAnsi="Arial" w:eastAsia="Arial" w:cs="Arial"/>
-                <w:i w:val="false"/>
-                <w:b w:val="false"/>
-                <w:u w:val="none"/>
-                <w:sz w:val="22"/>
-                <w:szCs w:val="22"/>
-                <w:color w:val="000000"/>
-              </w:rPr>
-              <w:t xml:space="preserve">-0.29</w:t>
-            </w:r>
-          </w:p>
-        </w:tc>
-        <w:tc>
-          <w:tcPr>
-            <w:tcBorders>
-              <w:bottom w:val="none" w:sz="0" w:space="0" w:color="000000"/>
-              <w:top w:val="none" w:sz="0" w:space="0" w:color="000000"/>
-              <w:left w:val="none" w:sz="0" w:space="0" w:color="000000"/>
-              <w:right w:val="none" w:sz="0" w:space="0" w:color="000000"/>
-            </w:tcBorders>
-            <w:shd w:val="clear" w:color="auto" w:fill="FFFFFF"/>
-            <w:tcMar>
-              <w:top w:w="0" w:type="dxa"/>
-              <w:bottom w:w="0" w:type="dxa"/>
-              <w:left w:w="0" w:type="dxa"/>
-              <w:right w:w="0" w:type="dxa"/>
-            </w:tcMar>
-            <w:vAlign w:val="center"/>
-          </w:tcPr>
-          <w:p>
-            <w:pPr>
-              <w:pStyle w:val="Normal"/>
-              <w:jc w:val="right"/>
-              <w:pBdr>
-                <w:bottom w:val="none" w:sz="0" w:space="0" w:color="000000"/>
-                <w:top w:val="none" w:sz="0" w:space="0" w:color="000000"/>
-                <w:left w:val="none" w:sz="0" w:space="0" w:color="000000"/>
-                <w:right w:val="none" w:sz="0" w:space="0" w:color="000000"/>
-              </w:pBdr>
-              <w:spacing w:after="100" w:before="100" w:line="240"/>
-              <w:ind w:left="100" w:right="100" w:firstLine="0" w:firstLineChars="0"/>
-              <w:rPr>
-                <w:rFonts w:ascii="Arial" w:hAnsi="Arial" w:eastAsia="Arial" w:cs="Arial"/>
-                <w:i w:val="false"/>
-                <w:b w:val="false"/>
-                <w:u w:val="none"/>
-                <w:sz w:val="22"/>
-                <w:szCs w:val="22"/>
-                <w:color w:val="000000"/>
-              </w:rPr>
-            </w:pPr>
-            <w:r>
-              <w:rPr>
-                <w:rFonts w:ascii="Arial" w:hAnsi="Arial" w:eastAsia="Arial" w:cs="Arial"/>
-                <w:i w:val="false"/>
-                <w:b w:val="false"/>
-                <w:u w:val="none"/>
-                <w:sz w:val="22"/>
-                <w:szCs w:val="22"/>
-                <w:color w:val="000000"/>
-              </w:rPr>
-              <w:t xml:space="preserve">0.30</w:t>
+              <w:t xml:space="preserve">-0.02</w:t>
+            </w:r>
+          </w:p>
+        </w:tc>
+        <w:tc>
+          <w:tcPr>
+            <w:tcBorders>
+              <w:bottom w:val="none" w:sz="0" w:space="0" w:color="000000"/>
+              <w:top w:val="none" w:sz="0" w:space="0" w:color="000000"/>
+              <w:left w:val="none" w:sz="0" w:space="0" w:color="000000"/>
+              <w:right w:val="none" w:sz="0" w:space="0" w:color="000000"/>
+            </w:tcBorders>
+            <w:shd w:val="clear" w:color="auto" w:fill="FFFFFF"/>
+            <w:tcMar>
+              <w:top w:w="0" w:type="dxa"/>
+              <w:bottom w:w="0" w:type="dxa"/>
+              <w:left w:w="0" w:type="dxa"/>
+              <w:right w:w="0" w:type="dxa"/>
+            </w:tcMar>
+            <w:vAlign w:val="center"/>
+          </w:tcPr>
+          <w:p>
+            <w:pPr>
+              <w:pStyle w:val="Normal"/>
+              <w:jc w:val="right"/>
+              <w:pBdr>
+                <w:bottom w:val="none" w:sz="0" w:space="0" w:color="000000"/>
+                <w:top w:val="none" w:sz="0" w:space="0" w:color="000000"/>
+                <w:left w:val="none" w:sz="0" w:space="0" w:color="000000"/>
+                <w:right w:val="none" w:sz="0" w:space="0" w:color="000000"/>
+              </w:pBdr>
+              <w:spacing w:after="100" w:before="100" w:line="240"/>
+              <w:ind w:left="100" w:right="100" w:firstLine="0" w:firstLineChars="0"/>
+              <w:rPr>
+                <w:rFonts w:ascii="Arial" w:hAnsi="Arial" w:eastAsia="Arial" w:cs="Arial"/>
+                <w:i w:val="false"/>
+                <w:b w:val="false"/>
+                <w:u w:val="none"/>
+                <w:sz w:val="22"/>
+                <w:szCs w:val="22"/>
+                <w:color w:val="000000"/>
+              </w:rPr>
+            </w:pPr>
+            <w:r>
+              <w:rPr>
+                <w:rFonts w:ascii="Arial" w:hAnsi="Arial" w:eastAsia="Arial" w:cs="Arial"/>
+                <w:i w:val="false"/>
+                <w:b w:val="false"/>
+                <w:u w:val="none"/>
+                <w:sz w:val="22"/>
+                <w:szCs w:val="22"/>
+                <w:color w:val="000000"/>
+              </w:rPr>
+              <w:t xml:space="preserve">-0.32</w:t>
+            </w:r>
+          </w:p>
+        </w:tc>
+        <w:tc>
+          <w:tcPr>
+            <w:tcBorders>
+              <w:bottom w:val="none" w:sz="0" w:space="0" w:color="000000"/>
+              <w:top w:val="none" w:sz="0" w:space="0" w:color="000000"/>
+              <w:left w:val="none" w:sz="0" w:space="0" w:color="000000"/>
+              <w:right w:val="none" w:sz="0" w:space="0" w:color="000000"/>
+            </w:tcBorders>
+            <w:shd w:val="clear" w:color="auto" w:fill="FFFFFF"/>
+            <w:tcMar>
+              <w:top w:w="0" w:type="dxa"/>
+              <w:bottom w:w="0" w:type="dxa"/>
+              <w:left w:w="0" w:type="dxa"/>
+              <w:right w:w="0" w:type="dxa"/>
+            </w:tcMar>
+            <w:vAlign w:val="center"/>
+          </w:tcPr>
+          <w:p>
+            <w:pPr>
+              <w:pStyle w:val="Normal"/>
+              <w:jc w:val="right"/>
+              <w:pBdr>
+                <w:bottom w:val="none" w:sz="0" w:space="0" w:color="000000"/>
+                <w:top w:val="none" w:sz="0" w:space="0" w:color="000000"/>
+                <w:left w:val="none" w:sz="0" w:space="0" w:color="000000"/>
+                <w:right w:val="none" w:sz="0" w:space="0" w:color="000000"/>
+              </w:pBdr>
+              <w:spacing w:after="100" w:before="100" w:line="240"/>
+              <w:ind w:left="100" w:right="100" w:firstLine="0" w:firstLineChars="0"/>
+              <w:rPr>
+                <w:rFonts w:ascii="Arial" w:hAnsi="Arial" w:eastAsia="Arial" w:cs="Arial"/>
+                <w:i w:val="false"/>
+                <w:b w:val="false"/>
+                <w:u w:val="none"/>
+                <w:sz w:val="22"/>
+                <w:szCs w:val="22"/>
+                <w:color w:val="000000"/>
+              </w:rPr>
+            </w:pPr>
+            <w:r>
+              <w:rPr>
+                <w:rFonts w:ascii="Arial" w:hAnsi="Arial" w:eastAsia="Arial" w:cs="Arial"/>
+                <w:i w:val="false"/>
+                <w:b w:val="false"/>
+                <w:u w:val="none"/>
+                <w:sz w:val="22"/>
+                <w:szCs w:val="22"/>
+                <w:color w:val="000000"/>
+              </w:rPr>
+              <w:t xml:space="preserve">0.27</w:t>
             </w:r>
           </w:p>
         </w:tc>
@@ -3104,113 +3104,113 @@
                 <w:szCs w:val="22"/>
                 <w:color w:val="000000"/>
               </w:rPr>
-              <w:t xml:space="preserve">0.07</w:t>
-            </w:r>
-          </w:p>
-        </w:tc>
-        <w:tc>
-          <w:tcPr>
-            <w:tcBorders>
-              <w:bottom w:val="none" w:sz="0" w:space="0" w:color="000000"/>
-              <w:top w:val="none" w:sz="0" w:space="0" w:color="000000"/>
-              <w:left w:val="none" w:sz="0" w:space="0" w:color="000000"/>
-              <w:right w:val="none" w:sz="0" w:space="0" w:color="000000"/>
-            </w:tcBorders>
-            <w:shd w:val="clear" w:color="auto" w:fill="FFFFFF"/>
-            <w:tcMar>
-              <w:top w:w="0" w:type="dxa"/>
-              <w:bottom w:w="0" w:type="dxa"/>
-              <w:left w:w="0" w:type="dxa"/>
-              <w:right w:w="0" w:type="dxa"/>
-            </w:tcMar>
-            <w:vAlign w:val="center"/>
-          </w:tcPr>
-          <w:p>
-            <w:pPr>
-              <w:pStyle w:val="Normal"/>
-              <w:jc w:val="right"/>
-              <w:pBdr>
-                <w:bottom w:val="none" w:sz="0" w:space="0" w:color="000000"/>
-                <w:top w:val="none" w:sz="0" w:space="0" w:color="000000"/>
-                <w:left w:val="none" w:sz="0" w:space="0" w:color="000000"/>
-                <w:right w:val="none" w:sz="0" w:space="0" w:color="000000"/>
-              </w:pBdr>
-              <w:spacing w:after="100" w:before="100" w:line="240"/>
-              <w:ind w:left="100" w:right="100" w:firstLine="0" w:firstLineChars="0"/>
-              <w:rPr>
-                <w:rFonts w:ascii="Arial" w:hAnsi="Arial" w:eastAsia="Arial" w:cs="Arial"/>
-                <w:i w:val="false"/>
-                <w:b w:val="false"/>
-                <w:u w:val="none"/>
-                <w:sz w:val="22"/>
-                <w:szCs w:val="22"/>
-                <w:color w:val="000000"/>
-              </w:rPr>
-            </w:pPr>
-            <w:r>
-              <w:rPr>
-                <w:rFonts w:ascii="Arial" w:hAnsi="Arial" w:eastAsia="Arial" w:cs="Arial"/>
-                <w:i w:val="false"/>
-                <w:b w:val="false"/>
-                <w:u w:val="none"/>
-                <w:sz w:val="22"/>
-                <w:szCs w:val="22"/>
-                <w:color w:val="000000"/>
-              </w:rPr>
-              <w:t xml:space="preserve">-0.18</w:t>
-            </w:r>
-          </w:p>
-        </w:tc>
-        <w:tc>
-          <w:tcPr>
-            <w:tcBorders>
-              <w:bottom w:val="none" w:sz="0" w:space="0" w:color="000000"/>
-              <w:top w:val="none" w:sz="0" w:space="0" w:color="000000"/>
-              <w:left w:val="none" w:sz="0" w:space="0" w:color="000000"/>
-              <w:right w:val="none" w:sz="0" w:space="0" w:color="000000"/>
-            </w:tcBorders>
-            <w:shd w:val="clear" w:color="auto" w:fill="FFFFFF"/>
-            <w:tcMar>
-              <w:top w:w="0" w:type="dxa"/>
-              <w:bottom w:w="0" w:type="dxa"/>
-              <w:left w:w="0" w:type="dxa"/>
-              <w:right w:w="0" w:type="dxa"/>
-            </w:tcMar>
-            <w:vAlign w:val="center"/>
-          </w:tcPr>
-          <w:p>
-            <w:pPr>
-              <w:pStyle w:val="Normal"/>
-              <w:jc w:val="right"/>
-              <w:pBdr>
-                <w:bottom w:val="none" w:sz="0" w:space="0" w:color="000000"/>
-                <w:top w:val="none" w:sz="0" w:space="0" w:color="000000"/>
-                <w:left w:val="none" w:sz="0" w:space="0" w:color="000000"/>
-                <w:right w:val="none" w:sz="0" w:space="0" w:color="000000"/>
-              </w:pBdr>
-              <w:spacing w:after="100" w:before="100" w:line="240"/>
-              <w:ind w:left="100" w:right="100" w:firstLine="0" w:firstLineChars="0"/>
-              <w:rPr>
-                <w:rFonts w:ascii="Arial" w:hAnsi="Arial" w:eastAsia="Arial" w:cs="Arial"/>
-                <w:i w:val="false"/>
-                <w:b w:val="false"/>
-                <w:u w:val="none"/>
-                <w:sz w:val="22"/>
-                <w:szCs w:val="22"/>
-                <w:color w:val="000000"/>
-              </w:rPr>
-            </w:pPr>
-            <w:r>
-              <w:rPr>
-                <w:rFonts w:ascii="Arial" w:hAnsi="Arial" w:eastAsia="Arial" w:cs="Arial"/>
-                <w:i w:val="false"/>
-                <w:b w:val="false"/>
-                <w:u w:val="none"/>
-                <w:sz w:val="22"/>
-                <w:szCs w:val="22"/>
-                <w:color w:val="000000"/>
-              </w:rPr>
-              <w:t xml:space="preserve">0.34</w:t>
+              <w:t xml:space="preserve">0.10</w:t>
+            </w:r>
+          </w:p>
+        </w:tc>
+        <w:tc>
+          <w:tcPr>
+            <w:tcBorders>
+              <w:bottom w:val="none" w:sz="0" w:space="0" w:color="000000"/>
+              <w:top w:val="none" w:sz="0" w:space="0" w:color="000000"/>
+              <w:left w:val="none" w:sz="0" w:space="0" w:color="000000"/>
+              <w:right w:val="none" w:sz="0" w:space="0" w:color="000000"/>
+            </w:tcBorders>
+            <w:shd w:val="clear" w:color="auto" w:fill="FFFFFF"/>
+            <w:tcMar>
+              <w:top w:w="0" w:type="dxa"/>
+              <w:bottom w:w="0" w:type="dxa"/>
+              <w:left w:w="0" w:type="dxa"/>
+              <w:right w:w="0" w:type="dxa"/>
+            </w:tcMar>
+            <w:vAlign w:val="center"/>
+          </w:tcPr>
+          <w:p>
+            <w:pPr>
+              <w:pStyle w:val="Normal"/>
+              <w:jc w:val="right"/>
+              <w:pBdr>
+                <w:bottom w:val="none" w:sz="0" w:space="0" w:color="000000"/>
+                <w:top w:val="none" w:sz="0" w:space="0" w:color="000000"/>
+                <w:left w:val="none" w:sz="0" w:space="0" w:color="000000"/>
+                <w:right w:val="none" w:sz="0" w:space="0" w:color="000000"/>
+              </w:pBdr>
+              <w:spacing w:after="100" w:before="100" w:line="240"/>
+              <w:ind w:left="100" w:right="100" w:firstLine="0" w:firstLineChars="0"/>
+              <w:rPr>
+                <w:rFonts w:ascii="Arial" w:hAnsi="Arial" w:eastAsia="Arial" w:cs="Arial"/>
+                <w:i w:val="false"/>
+                <w:b w:val="false"/>
+                <w:u w:val="none"/>
+                <w:sz w:val="22"/>
+                <w:szCs w:val="22"/>
+                <w:color w:val="000000"/>
+              </w:rPr>
+            </w:pPr>
+            <w:r>
+              <w:rPr>
+                <w:rFonts w:ascii="Arial" w:hAnsi="Arial" w:eastAsia="Arial" w:cs="Arial"/>
+                <w:i w:val="false"/>
+                <w:b w:val="false"/>
+                <w:u w:val="none"/>
+                <w:sz w:val="22"/>
+                <w:szCs w:val="22"/>
+                <w:color w:val="000000"/>
+              </w:rPr>
+              <w:t xml:space="preserve">-0.17</w:t>
+            </w:r>
+          </w:p>
+        </w:tc>
+        <w:tc>
+          <w:tcPr>
+            <w:tcBorders>
+              <w:bottom w:val="none" w:sz="0" w:space="0" w:color="000000"/>
+              <w:top w:val="none" w:sz="0" w:space="0" w:color="000000"/>
+              <w:left w:val="none" w:sz="0" w:space="0" w:color="000000"/>
+              <w:right w:val="none" w:sz="0" w:space="0" w:color="000000"/>
+            </w:tcBorders>
+            <w:shd w:val="clear" w:color="auto" w:fill="FFFFFF"/>
+            <w:tcMar>
+              <w:top w:w="0" w:type="dxa"/>
+              <w:bottom w:w="0" w:type="dxa"/>
+              <w:left w:w="0" w:type="dxa"/>
+              <w:right w:w="0" w:type="dxa"/>
+            </w:tcMar>
+            <w:vAlign w:val="center"/>
+          </w:tcPr>
+          <w:p>
+            <w:pPr>
+              <w:pStyle w:val="Normal"/>
+              <w:jc w:val="right"/>
+              <w:pBdr>
+                <w:bottom w:val="none" w:sz="0" w:space="0" w:color="000000"/>
+                <w:top w:val="none" w:sz="0" w:space="0" w:color="000000"/>
+                <w:left w:val="none" w:sz="0" w:space="0" w:color="000000"/>
+                <w:right w:val="none" w:sz="0" w:space="0" w:color="000000"/>
+              </w:pBdr>
+              <w:spacing w:after="100" w:before="100" w:line="240"/>
+              <w:ind w:left="100" w:right="100" w:firstLine="0" w:firstLineChars="0"/>
+              <w:rPr>
+                <w:rFonts w:ascii="Arial" w:hAnsi="Arial" w:eastAsia="Arial" w:cs="Arial"/>
+                <w:i w:val="false"/>
+                <w:b w:val="false"/>
+                <w:u w:val="none"/>
+                <w:sz w:val="22"/>
+                <w:szCs w:val="22"/>
+                <w:color w:val="000000"/>
+              </w:rPr>
+            </w:pPr>
+            <w:r>
+              <w:rPr>
+                <w:rFonts w:ascii="Arial" w:hAnsi="Arial" w:eastAsia="Arial" w:cs="Arial"/>
+                <w:i w:val="false"/>
+                <w:b w:val="false"/>
+                <w:u w:val="none"/>
+                <w:sz w:val="22"/>
+                <w:szCs w:val="22"/>
+                <w:color w:val="000000"/>
+              </w:rPr>
+              <w:t xml:space="preserve">0.35</w:t>
             </w:r>
           </w:p>
         </w:tc>
@@ -3481,7 +3481,7 @@
                 <w:szCs w:val="22"/>
                 <w:color w:val="000000"/>
               </w:rPr>
-              <w:t xml:space="preserve">0.20</w:t>
+              <w:t xml:space="preserve">0.19</w:t>
             </w:r>
           </w:p>
         </w:tc>
@@ -3646,113 +3646,113 @@
                 <w:szCs w:val="22"/>
                 <w:color w:val="000000"/>
               </w:rPr>
-              <w:t xml:space="preserve">0.63</w:t>
-            </w:r>
-          </w:p>
-        </w:tc>
-        <w:tc>
-          <w:tcPr>
-            <w:tcBorders>
-              <w:bottom w:val="none" w:sz="0" w:space="0" w:color="000000"/>
-              <w:top w:val="none" w:sz="0" w:space="0" w:color="000000"/>
-              <w:left w:val="none" w:sz="0" w:space="0" w:color="000000"/>
-              <w:right w:val="none" w:sz="0" w:space="0" w:color="000000"/>
-            </w:tcBorders>
-            <w:shd w:val="clear" w:color="auto" w:fill="FFFFFF"/>
-            <w:tcMar>
-              <w:top w:w="0" w:type="dxa"/>
-              <w:bottom w:w="0" w:type="dxa"/>
-              <w:left w:w="0" w:type="dxa"/>
-              <w:right w:w="0" w:type="dxa"/>
-            </w:tcMar>
-            <w:vAlign w:val="center"/>
-          </w:tcPr>
-          <w:p>
-            <w:pPr>
-              <w:pStyle w:val="Normal"/>
-              <w:jc w:val="right"/>
-              <w:pBdr>
-                <w:bottom w:val="none" w:sz="0" w:space="0" w:color="000000"/>
-                <w:top w:val="none" w:sz="0" w:space="0" w:color="000000"/>
-                <w:left w:val="none" w:sz="0" w:space="0" w:color="000000"/>
-                <w:right w:val="none" w:sz="0" w:space="0" w:color="000000"/>
-              </w:pBdr>
-              <w:spacing w:after="100" w:before="100" w:line="240"/>
-              <w:ind w:left="100" w:right="100" w:firstLine="0" w:firstLineChars="0"/>
-              <w:rPr>
-                <w:rFonts w:ascii="Arial" w:hAnsi="Arial" w:eastAsia="Arial" w:cs="Arial"/>
-                <w:i w:val="false"/>
-                <w:b w:val="false"/>
-                <w:u w:val="none"/>
-                <w:sz w:val="22"/>
-                <w:szCs w:val="22"/>
-                <w:color w:val="000000"/>
-              </w:rPr>
-            </w:pPr>
-            <w:r>
-              <w:rPr>
-                <w:rFonts w:ascii="Arial" w:hAnsi="Arial" w:eastAsia="Arial" w:cs="Arial"/>
-                <w:i w:val="false"/>
-                <w:b w:val="false"/>
-                <w:u w:val="none"/>
-                <w:sz w:val="22"/>
-                <w:szCs w:val="22"/>
-                <w:color w:val="000000"/>
-              </w:rPr>
-              <w:t xml:space="preserve">0.40</w:t>
-            </w:r>
-          </w:p>
-        </w:tc>
-        <w:tc>
-          <w:tcPr>
-            <w:tcBorders>
-              <w:bottom w:val="none" w:sz="0" w:space="0" w:color="000000"/>
-              <w:top w:val="none" w:sz="0" w:space="0" w:color="000000"/>
-              <w:left w:val="none" w:sz="0" w:space="0" w:color="000000"/>
-              <w:right w:val="none" w:sz="0" w:space="0" w:color="000000"/>
-            </w:tcBorders>
-            <w:shd w:val="clear" w:color="auto" w:fill="FFFFFF"/>
-            <w:tcMar>
-              <w:top w:w="0" w:type="dxa"/>
-              <w:bottom w:w="0" w:type="dxa"/>
-              <w:left w:w="0" w:type="dxa"/>
-              <w:right w:w="0" w:type="dxa"/>
-            </w:tcMar>
-            <w:vAlign w:val="center"/>
-          </w:tcPr>
-          <w:p>
-            <w:pPr>
-              <w:pStyle w:val="Normal"/>
-              <w:jc w:val="right"/>
-              <w:pBdr>
-                <w:bottom w:val="none" w:sz="0" w:space="0" w:color="000000"/>
-                <w:top w:val="none" w:sz="0" w:space="0" w:color="000000"/>
-                <w:left w:val="none" w:sz="0" w:space="0" w:color="000000"/>
-                <w:right w:val="none" w:sz="0" w:space="0" w:color="000000"/>
-              </w:pBdr>
-              <w:spacing w:after="100" w:before="100" w:line="240"/>
-              <w:ind w:left="100" w:right="100" w:firstLine="0" w:firstLineChars="0"/>
-              <w:rPr>
-                <w:rFonts w:ascii="Arial" w:hAnsi="Arial" w:eastAsia="Arial" w:cs="Arial"/>
-                <w:i w:val="false"/>
-                <w:b w:val="false"/>
-                <w:u w:val="none"/>
-                <w:sz w:val="22"/>
-                <w:szCs w:val="22"/>
-                <w:color w:val="000000"/>
-              </w:rPr>
-            </w:pPr>
-            <w:r>
-              <w:rPr>
-                <w:rFonts w:ascii="Arial" w:hAnsi="Arial" w:eastAsia="Arial" w:cs="Arial"/>
-                <w:i w:val="false"/>
-                <w:b w:val="false"/>
-                <w:u w:val="none"/>
-                <w:sz w:val="22"/>
-                <w:szCs w:val="22"/>
-                <w:color w:val="000000"/>
-              </w:rPr>
-              <w:t xml:space="preserve">0.86</w:t>
+              <w:t xml:space="preserve">0.61</w:t>
+            </w:r>
+          </w:p>
+        </w:tc>
+        <w:tc>
+          <w:tcPr>
+            <w:tcBorders>
+              <w:bottom w:val="none" w:sz="0" w:space="0" w:color="000000"/>
+              <w:top w:val="none" w:sz="0" w:space="0" w:color="000000"/>
+              <w:left w:val="none" w:sz="0" w:space="0" w:color="000000"/>
+              <w:right w:val="none" w:sz="0" w:space="0" w:color="000000"/>
+            </w:tcBorders>
+            <w:shd w:val="clear" w:color="auto" w:fill="FFFFFF"/>
+            <w:tcMar>
+              <w:top w:w="0" w:type="dxa"/>
+              <w:bottom w:w="0" w:type="dxa"/>
+              <w:left w:w="0" w:type="dxa"/>
+              <w:right w:w="0" w:type="dxa"/>
+            </w:tcMar>
+            <w:vAlign w:val="center"/>
+          </w:tcPr>
+          <w:p>
+            <w:pPr>
+              <w:pStyle w:val="Normal"/>
+              <w:jc w:val="right"/>
+              <w:pBdr>
+                <w:bottom w:val="none" w:sz="0" w:space="0" w:color="000000"/>
+                <w:top w:val="none" w:sz="0" w:space="0" w:color="000000"/>
+                <w:left w:val="none" w:sz="0" w:space="0" w:color="000000"/>
+                <w:right w:val="none" w:sz="0" w:space="0" w:color="000000"/>
+              </w:pBdr>
+              <w:spacing w:after="100" w:before="100" w:line="240"/>
+              <w:ind w:left="100" w:right="100" w:firstLine="0" w:firstLineChars="0"/>
+              <w:rPr>
+                <w:rFonts w:ascii="Arial" w:hAnsi="Arial" w:eastAsia="Arial" w:cs="Arial"/>
+                <w:i w:val="false"/>
+                <w:b w:val="false"/>
+                <w:u w:val="none"/>
+                <w:sz w:val="22"/>
+                <w:szCs w:val="22"/>
+                <w:color w:val="000000"/>
+              </w:rPr>
+            </w:pPr>
+            <w:r>
+              <w:rPr>
+                <w:rFonts w:ascii="Arial" w:hAnsi="Arial" w:eastAsia="Arial" w:cs="Arial"/>
+                <w:i w:val="false"/>
+                <w:b w:val="false"/>
+                <w:u w:val="none"/>
+                <w:sz w:val="22"/>
+                <w:szCs w:val="22"/>
+                <w:color w:val="000000"/>
+              </w:rPr>
+              <w:t xml:space="preserve">0.38</w:t>
+            </w:r>
+          </w:p>
+        </w:tc>
+        <w:tc>
+          <w:tcPr>
+            <w:tcBorders>
+              <w:bottom w:val="none" w:sz="0" w:space="0" w:color="000000"/>
+              <w:top w:val="none" w:sz="0" w:space="0" w:color="000000"/>
+              <w:left w:val="none" w:sz="0" w:space="0" w:color="000000"/>
+              <w:right w:val="none" w:sz="0" w:space="0" w:color="000000"/>
+            </w:tcBorders>
+            <w:shd w:val="clear" w:color="auto" w:fill="FFFFFF"/>
+            <w:tcMar>
+              <w:top w:w="0" w:type="dxa"/>
+              <w:bottom w:w="0" w:type="dxa"/>
+              <w:left w:w="0" w:type="dxa"/>
+              <w:right w:w="0" w:type="dxa"/>
+            </w:tcMar>
+            <w:vAlign w:val="center"/>
+          </w:tcPr>
+          <w:p>
+            <w:pPr>
+              <w:pStyle w:val="Normal"/>
+              <w:jc w:val="right"/>
+              <w:pBdr>
+                <w:bottom w:val="none" w:sz="0" w:space="0" w:color="000000"/>
+                <w:top w:val="none" w:sz="0" w:space="0" w:color="000000"/>
+                <w:left w:val="none" w:sz="0" w:space="0" w:color="000000"/>
+                <w:right w:val="none" w:sz="0" w:space="0" w:color="000000"/>
+              </w:pBdr>
+              <w:spacing w:after="100" w:before="100" w:line="240"/>
+              <w:ind w:left="100" w:right="100" w:firstLine="0" w:firstLineChars="0"/>
+              <w:rPr>
+                <w:rFonts w:ascii="Arial" w:hAnsi="Arial" w:eastAsia="Arial" w:cs="Arial"/>
+                <w:i w:val="false"/>
+                <w:b w:val="false"/>
+                <w:u w:val="none"/>
+                <w:sz w:val="22"/>
+                <w:szCs w:val="22"/>
+                <w:color w:val="000000"/>
+              </w:rPr>
+            </w:pPr>
+            <w:r>
+              <w:rPr>
+                <w:rFonts w:ascii="Arial" w:hAnsi="Arial" w:eastAsia="Arial" w:cs="Arial"/>
+                <w:i w:val="false"/>
+                <w:b w:val="false"/>
+                <w:u w:val="none"/>
+                <w:sz w:val="22"/>
+                <w:szCs w:val="22"/>
+                <w:color w:val="000000"/>
+              </w:rPr>
+              <w:t xml:space="preserve">0.84</w:t>
             </w:r>
           </w:p>
         </w:tc>
@@ -3917,113 +3917,113 @@
                 <w:szCs w:val="22"/>
                 <w:color w:val="000000"/>
               </w:rPr>
-              <w:t xml:space="preserve">-0.31</w:t>
-            </w:r>
-          </w:p>
-        </w:tc>
-        <w:tc>
-          <w:tcPr>
-            <w:tcBorders>
-              <w:bottom w:val="none" w:sz="0" w:space="0" w:color="000000"/>
-              <w:top w:val="none" w:sz="0" w:space="0" w:color="000000"/>
-              <w:left w:val="none" w:sz="0" w:space="0" w:color="000000"/>
-              <w:right w:val="none" w:sz="0" w:space="0" w:color="000000"/>
-            </w:tcBorders>
-            <w:shd w:val="clear" w:color="auto" w:fill="FFFFFF"/>
-            <w:tcMar>
-              <w:top w:w="0" w:type="dxa"/>
-              <w:bottom w:w="0" w:type="dxa"/>
-              <w:left w:w="0" w:type="dxa"/>
-              <w:right w:w="0" w:type="dxa"/>
-            </w:tcMar>
-            <w:vAlign w:val="center"/>
-          </w:tcPr>
-          <w:p>
-            <w:pPr>
-              <w:pStyle w:val="Normal"/>
-              <w:jc w:val="right"/>
-              <w:pBdr>
-                <w:bottom w:val="none" w:sz="0" w:space="0" w:color="000000"/>
-                <w:top w:val="none" w:sz="0" w:space="0" w:color="000000"/>
-                <w:left w:val="none" w:sz="0" w:space="0" w:color="000000"/>
-                <w:right w:val="none" w:sz="0" w:space="0" w:color="000000"/>
-              </w:pBdr>
-              <w:spacing w:after="100" w:before="100" w:line="240"/>
-              <w:ind w:left="100" w:right="100" w:firstLine="0" w:firstLineChars="0"/>
-              <w:rPr>
-                <w:rFonts w:ascii="Arial" w:hAnsi="Arial" w:eastAsia="Arial" w:cs="Arial"/>
-                <w:i w:val="false"/>
-                <w:b w:val="false"/>
-                <w:u w:val="none"/>
-                <w:sz w:val="22"/>
-                <w:szCs w:val="22"/>
-                <w:color w:val="000000"/>
-              </w:rPr>
-            </w:pPr>
-            <w:r>
-              <w:rPr>
-                <w:rFonts w:ascii="Arial" w:hAnsi="Arial" w:eastAsia="Arial" w:cs="Arial"/>
-                <w:i w:val="false"/>
-                <w:b w:val="false"/>
-                <w:u w:val="none"/>
-                <w:sz w:val="22"/>
-                <w:szCs w:val="22"/>
-                <w:color w:val="000000"/>
-              </w:rPr>
-              <w:t xml:space="preserve">-0.51</w:t>
-            </w:r>
-          </w:p>
-        </w:tc>
-        <w:tc>
-          <w:tcPr>
-            <w:tcBorders>
-              <w:bottom w:val="none" w:sz="0" w:space="0" w:color="000000"/>
-              <w:top w:val="none" w:sz="0" w:space="0" w:color="000000"/>
-              <w:left w:val="none" w:sz="0" w:space="0" w:color="000000"/>
-              <w:right w:val="none" w:sz="0" w:space="0" w:color="000000"/>
-            </w:tcBorders>
-            <w:shd w:val="clear" w:color="auto" w:fill="FFFFFF"/>
-            <w:tcMar>
-              <w:top w:w="0" w:type="dxa"/>
-              <w:bottom w:w="0" w:type="dxa"/>
-              <w:left w:w="0" w:type="dxa"/>
-              <w:right w:w="0" w:type="dxa"/>
-            </w:tcMar>
-            <w:vAlign w:val="center"/>
-          </w:tcPr>
-          <w:p>
-            <w:pPr>
-              <w:pStyle w:val="Normal"/>
-              <w:jc w:val="right"/>
-              <w:pBdr>
-                <w:bottom w:val="none" w:sz="0" w:space="0" w:color="000000"/>
-                <w:top w:val="none" w:sz="0" w:space="0" w:color="000000"/>
-                <w:left w:val="none" w:sz="0" w:space="0" w:color="000000"/>
-                <w:right w:val="none" w:sz="0" w:space="0" w:color="000000"/>
-              </w:pBdr>
-              <w:spacing w:after="100" w:before="100" w:line="240"/>
-              <w:ind w:left="100" w:right="100" w:firstLine="0" w:firstLineChars="0"/>
-              <w:rPr>
-                <w:rFonts w:ascii="Arial" w:hAnsi="Arial" w:eastAsia="Arial" w:cs="Arial"/>
-                <w:i w:val="false"/>
-                <w:b w:val="false"/>
-                <w:u w:val="none"/>
-                <w:sz w:val="22"/>
-                <w:szCs w:val="22"/>
-                <w:color w:val="000000"/>
-              </w:rPr>
-            </w:pPr>
-            <w:r>
-              <w:rPr>
-                <w:rFonts w:ascii="Arial" w:hAnsi="Arial" w:eastAsia="Arial" w:cs="Arial"/>
-                <w:i w:val="false"/>
-                <w:b w:val="false"/>
-                <w:u w:val="none"/>
-                <w:sz w:val="22"/>
-                <w:szCs w:val="22"/>
-                <w:color w:val="000000"/>
-              </w:rPr>
-              <w:t xml:space="preserve">-0.11</w:t>
+              <w:t xml:space="preserve">-0.30</w:t>
+            </w:r>
+          </w:p>
+        </w:tc>
+        <w:tc>
+          <w:tcPr>
+            <w:tcBorders>
+              <w:bottom w:val="none" w:sz="0" w:space="0" w:color="000000"/>
+              <w:top w:val="none" w:sz="0" w:space="0" w:color="000000"/>
+              <w:left w:val="none" w:sz="0" w:space="0" w:color="000000"/>
+              <w:right w:val="none" w:sz="0" w:space="0" w:color="000000"/>
+            </w:tcBorders>
+            <w:shd w:val="clear" w:color="auto" w:fill="FFFFFF"/>
+            <w:tcMar>
+              <w:top w:w="0" w:type="dxa"/>
+              <w:bottom w:w="0" w:type="dxa"/>
+              <w:left w:w="0" w:type="dxa"/>
+              <w:right w:w="0" w:type="dxa"/>
+            </w:tcMar>
+            <w:vAlign w:val="center"/>
+          </w:tcPr>
+          <w:p>
+            <w:pPr>
+              <w:pStyle w:val="Normal"/>
+              <w:jc w:val="right"/>
+              <w:pBdr>
+                <w:bottom w:val="none" w:sz="0" w:space="0" w:color="000000"/>
+                <w:top w:val="none" w:sz="0" w:space="0" w:color="000000"/>
+                <w:left w:val="none" w:sz="0" w:space="0" w:color="000000"/>
+                <w:right w:val="none" w:sz="0" w:space="0" w:color="000000"/>
+              </w:pBdr>
+              <w:spacing w:after="100" w:before="100" w:line="240"/>
+              <w:ind w:left="100" w:right="100" w:firstLine="0" w:firstLineChars="0"/>
+              <w:rPr>
+                <w:rFonts w:ascii="Arial" w:hAnsi="Arial" w:eastAsia="Arial" w:cs="Arial"/>
+                <w:i w:val="false"/>
+                <w:b w:val="false"/>
+                <w:u w:val="none"/>
+                <w:sz w:val="22"/>
+                <w:szCs w:val="22"/>
+                <w:color w:val="000000"/>
+              </w:rPr>
+            </w:pPr>
+            <w:r>
+              <w:rPr>
+                <w:rFonts w:ascii="Arial" w:hAnsi="Arial" w:eastAsia="Arial" w:cs="Arial"/>
+                <w:i w:val="false"/>
+                <w:b w:val="false"/>
+                <w:u w:val="none"/>
+                <w:sz w:val="22"/>
+                <w:szCs w:val="22"/>
+                <w:color w:val="000000"/>
+              </w:rPr>
+              <w:t xml:space="preserve">-0.50</w:t>
+            </w:r>
+          </w:p>
+        </w:tc>
+        <w:tc>
+          <w:tcPr>
+            <w:tcBorders>
+              <w:bottom w:val="none" w:sz="0" w:space="0" w:color="000000"/>
+              <w:top w:val="none" w:sz="0" w:space="0" w:color="000000"/>
+              <w:left w:val="none" w:sz="0" w:space="0" w:color="000000"/>
+              <w:right w:val="none" w:sz="0" w:space="0" w:color="000000"/>
+            </w:tcBorders>
+            <w:shd w:val="clear" w:color="auto" w:fill="FFFFFF"/>
+            <w:tcMar>
+              <w:top w:w="0" w:type="dxa"/>
+              <w:bottom w:w="0" w:type="dxa"/>
+              <w:left w:w="0" w:type="dxa"/>
+              <w:right w:w="0" w:type="dxa"/>
+            </w:tcMar>
+            <w:vAlign w:val="center"/>
+          </w:tcPr>
+          <w:p>
+            <w:pPr>
+              <w:pStyle w:val="Normal"/>
+              <w:jc w:val="right"/>
+              <w:pBdr>
+                <w:bottom w:val="none" w:sz="0" w:space="0" w:color="000000"/>
+                <w:top w:val="none" w:sz="0" w:space="0" w:color="000000"/>
+                <w:left w:val="none" w:sz="0" w:space="0" w:color="000000"/>
+                <w:right w:val="none" w:sz="0" w:space="0" w:color="000000"/>
+              </w:pBdr>
+              <w:spacing w:after="100" w:before="100" w:line="240"/>
+              <w:ind w:left="100" w:right="100" w:firstLine="0" w:firstLineChars="0"/>
+              <w:rPr>
+                <w:rFonts w:ascii="Arial" w:hAnsi="Arial" w:eastAsia="Arial" w:cs="Arial"/>
+                <w:i w:val="false"/>
+                <w:b w:val="false"/>
+                <w:u w:val="none"/>
+                <w:sz w:val="22"/>
+                <w:szCs w:val="22"/>
+                <w:color w:val="000000"/>
+              </w:rPr>
+            </w:pPr>
+            <w:r>
+              <w:rPr>
+                <w:rFonts w:ascii="Arial" w:hAnsi="Arial" w:eastAsia="Arial" w:cs="Arial"/>
+                <w:i w:val="false"/>
+                <w:b w:val="false"/>
+                <w:u w:val="none"/>
+                <w:sz w:val="22"/>
+                <w:szCs w:val="22"/>
+                <w:color w:val="000000"/>
+              </w:rPr>
+              <w:t xml:space="preserve">-0.10</w:t>
             </w:r>
           </w:p>
         </w:tc>
@@ -4188,113 +4188,113 @@
                 <w:szCs w:val="22"/>
                 <w:color w:val="000000"/>
               </w:rPr>
-              <w:t xml:space="preserve">1.51</w:t>
-            </w:r>
-          </w:p>
-        </w:tc>
-        <w:tc>
-          <w:tcPr>
-            <w:tcBorders>
-              <w:bottom w:val="none" w:sz="0" w:space="0" w:color="000000"/>
-              <w:top w:val="none" w:sz="0" w:space="0" w:color="000000"/>
-              <w:left w:val="none" w:sz="0" w:space="0" w:color="000000"/>
-              <w:right w:val="none" w:sz="0" w:space="0" w:color="000000"/>
-            </w:tcBorders>
-            <w:shd w:val="clear" w:color="auto" w:fill="FFFFFF"/>
-            <w:tcMar>
-              <w:top w:w="0" w:type="dxa"/>
-              <w:bottom w:w="0" w:type="dxa"/>
-              <w:left w:w="0" w:type="dxa"/>
-              <w:right w:w="0" w:type="dxa"/>
-            </w:tcMar>
-            <w:vAlign w:val="center"/>
-          </w:tcPr>
-          <w:p>
-            <w:pPr>
-              <w:pStyle w:val="Normal"/>
-              <w:jc w:val="right"/>
-              <w:pBdr>
-                <w:bottom w:val="none" w:sz="0" w:space="0" w:color="000000"/>
-                <w:top w:val="none" w:sz="0" w:space="0" w:color="000000"/>
-                <w:left w:val="none" w:sz="0" w:space="0" w:color="000000"/>
-                <w:right w:val="none" w:sz="0" w:space="0" w:color="000000"/>
-              </w:pBdr>
-              <w:spacing w:after="100" w:before="100" w:line="240"/>
-              <w:ind w:left="100" w:right="100" w:firstLine="0" w:firstLineChars="0"/>
-              <w:rPr>
-                <w:rFonts w:ascii="Arial" w:hAnsi="Arial" w:eastAsia="Arial" w:cs="Arial"/>
-                <w:i w:val="false"/>
-                <w:b w:val="false"/>
-                <w:u w:val="none"/>
-                <w:sz w:val="22"/>
-                <w:szCs w:val="22"/>
-                <w:color w:val="000000"/>
-              </w:rPr>
-            </w:pPr>
-            <w:r>
-              <w:rPr>
-                <w:rFonts w:ascii="Arial" w:hAnsi="Arial" w:eastAsia="Arial" w:cs="Arial"/>
-                <w:i w:val="false"/>
-                <w:b w:val="false"/>
-                <w:u w:val="none"/>
-                <w:sz w:val="22"/>
-                <w:szCs w:val="22"/>
-                <w:color w:val="000000"/>
-              </w:rPr>
-              <w:t xml:space="preserve">1.02</w:t>
-            </w:r>
-          </w:p>
-        </w:tc>
-        <w:tc>
-          <w:tcPr>
-            <w:tcBorders>
-              <w:bottom w:val="none" w:sz="0" w:space="0" w:color="000000"/>
-              <w:top w:val="none" w:sz="0" w:space="0" w:color="000000"/>
-              <w:left w:val="none" w:sz="0" w:space="0" w:color="000000"/>
-              <w:right w:val="none" w:sz="0" w:space="0" w:color="000000"/>
-            </w:tcBorders>
-            <w:shd w:val="clear" w:color="auto" w:fill="FFFFFF"/>
-            <w:tcMar>
-              <w:top w:w="0" w:type="dxa"/>
-              <w:bottom w:w="0" w:type="dxa"/>
-              <w:left w:w="0" w:type="dxa"/>
-              <w:right w:w="0" w:type="dxa"/>
-            </w:tcMar>
-            <w:vAlign w:val="center"/>
-          </w:tcPr>
-          <w:p>
-            <w:pPr>
-              <w:pStyle w:val="Normal"/>
-              <w:jc w:val="right"/>
-              <w:pBdr>
-                <w:bottom w:val="none" w:sz="0" w:space="0" w:color="000000"/>
-                <w:top w:val="none" w:sz="0" w:space="0" w:color="000000"/>
-                <w:left w:val="none" w:sz="0" w:space="0" w:color="000000"/>
-                <w:right w:val="none" w:sz="0" w:space="0" w:color="000000"/>
-              </w:pBdr>
-              <w:spacing w:after="100" w:before="100" w:line="240"/>
-              <w:ind w:left="100" w:right="100" w:firstLine="0" w:firstLineChars="0"/>
-              <w:rPr>
-                <w:rFonts w:ascii="Arial" w:hAnsi="Arial" w:eastAsia="Arial" w:cs="Arial"/>
-                <w:i w:val="false"/>
-                <w:b w:val="false"/>
-                <w:u w:val="none"/>
-                <w:sz w:val="22"/>
-                <w:szCs w:val="22"/>
-                <w:color w:val="000000"/>
-              </w:rPr>
-            </w:pPr>
-            <w:r>
-              <w:rPr>
-                <w:rFonts w:ascii="Arial" w:hAnsi="Arial" w:eastAsia="Arial" w:cs="Arial"/>
-                <w:i w:val="false"/>
-                <w:b w:val="false"/>
-                <w:u w:val="none"/>
-                <w:sz w:val="22"/>
-                <w:szCs w:val="22"/>
-                <w:color w:val="000000"/>
-              </w:rPr>
-              <w:t xml:space="preserve">2.00</w:t>
+              <w:t xml:space="preserve">1.53</w:t>
+            </w:r>
+          </w:p>
+        </w:tc>
+        <w:tc>
+          <w:tcPr>
+            <w:tcBorders>
+              <w:bottom w:val="none" w:sz="0" w:space="0" w:color="000000"/>
+              <w:top w:val="none" w:sz="0" w:space="0" w:color="000000"/>
+              <w:left w:val="none" w:sz="0" w:space="0" w:color="000000"/>
+              <w:right w:val="none" w:sz="0" w:space="0" w:color="000000"/>
+            </w:tcBorders>
+            <w:shd w:val="clear" w:color="auto" w:fill="FFFFFF"/>
+            <w:tcMar>
+              <w:top w:w="0" w:type="dxa"/>
+              <w:bottom w:w="0" w:type="dxa"/>
+              <w:left w:w="0" w:type="dxa"/>
+              <w:right w:w="0" w:type="dxa"/>
+            </w:tcMar>
+            <w:vAlign w:val="center"/>
+          </w:tcPr>
+          <w:p>
+            <w:pPr>
+              <w:pStyle w:val="Normal"/>
+              <w:jc w:val="right"/>
+              <w:pBdr>
+                <w:bottom w:val="none" w:sz="0" w:space="0" w:color="000000"/>
+                <w:top w:val="none" w:sz="0" w:space="0" w:color="000000"/>
+                <w:left w:val="none" w:sz="0" w:space="0" w:color="000000"/>
+                <w:right w:val="none" w:sz="0" w:space="0" w:color="000000"/>
+              </w:pBdr>
+              <w:spacing w:after="100" w:before="100" w:line="240"/>
+              <w:ind w:left="100" w:right="100" w:firstLine="0" w:firstLineChars="0"/>
+              <w:rPr>
+                <w:rFonts w:ascii="Arial" w:hAnsi="Arial" w:eastAsia="Arial" w:cs="Arial"/>
+                <w:i w:val="false"/>
+                <w:b w:val="false"/>
+                <w:u w:val="none"/>
+                <w:sz w:val="22"/>
+                <w:szCs w:val="22"/>
+                <w:color w:val="000000"/>
+              </w:rPr>
+            </w:pPr>
+            <w:r>
+              <w:rPr>
+                <w:rFonts w:ascii="Arial" w:hAnsi="Arial" w:eastAsia="Arial" w:cs="Arial"/>
+                <w:i w:val="false"/>
+                <w:b w:val="false"/>
+                <w:u w:val="none"/>
+                <w:sz w:val="22"/>
+                <w:szCs w:val="22"/>
+                <w:color w:val="000000"/>
+              </w:rPr>
+              <w:t xml:space="preserve">1.05</w:t>
+            </w:r>
+          </w:p>
+        </w:tc>
+        <w:tc>
+          <w:tcPr>
+            <w:tcBorders>
+              <w:bottom w:val="none" w:sz="0" w:space="0" w:color="000000"/>
+              <w:top w:val="none" w:sz="0" w:space="0" w:color="000000"/>
+              <w:left w:val="none" w:sz="0" w:space="0" w:color="000000"/>
+              <w:right w:val="none" w:sz="0" w:space="0" w:color="000000"/>
+            </w:tcBorders>
+            <w:shd w:val="clear" w:color="auto" w:fill="FFFFFF"/>
+            <w:tcMar>
+              <w:top w:w="0" w:type="dxa"/>
+              <w:bottom w:w="0" w:type="dxa"/>
+              <w:left w:w="0" w:type="dxa"/>
+              <w:right w:w="0" w:type="dxa"/>
+            </w:tcMar>
+            <w:vAlign w:val="center"/>
+          </w:tcPr>
+          <w:p>
+            <w:pPr>
+              <w:pStyle w:val="Normal"/>
+              <w:jc w:val="right"/>
+              <w:pBdr>
+                <w:bottom w:val="none" w:sz="0" w:space="0" w:color="000000"/>
+                <w:top w:val="none" w:sz="0" w:space="0" w:color="000000"/>
+                <w:left w:val="none" w:sz="0" w:space="0" w:color="000000"/>
+                <w:right w:val="none" w:sz="0" w:space="0" w:color="000000"/>
+              </w:pBdr>
+              <w:spacing w:after="100" w:before="100" w:line="240"/>
+              <w:ind w:left="100" w:right="100" w:firstLine="0" w:firstLineChars="0"/>
+              <w:rPr>
+                <w:rFonts w:ascii="Arial" w:hAnsi="Arial" w:eastAsia="Arial" w:cs="Arial"/>
+                <w:i w:val="false"/>
+                <w:b w:val="false"/>
+                <w:u w:val="none"/>
+                <w:sz w:val="22"/>
+                <w:szCs w:val="22"/>
+                <w:color w:val="000000"/>
+              </w:rPr>
+            </w:pPr>
+            <w:r>
+              <w:rPr>
+                <w:rFonts w:ascii="Arial" w:hAnsi="Arial" w:eastAsia="Arial" w:cs="Arial"/>
+                <w:i w:val="false"/>
+                <w:b w:val="false"/>
+                <w:u w:val="none"/>
+                <w:sz w:val="22"/>
+                <w:szCs w:val="22"/>
+                <w:color w:val="000000"/>
+              </w:rPr>
+              <w:t xml:space="preserve">2.02</w:t>
             </w:r>
           </w:p>
         </w:tc>
@@ -4360,6 +4360,277 @@
         <w:tc>
           <w:tcPr>
             <w:tcBorders>
+              <w:bottom w:val="none" w:sz="0" w:space="0" w:color="000000"/>
+              <w:top w:val="none" w:sz="0" w:space="0" w:color="000000"/>
+              <w:left w:val="none" w:sz="0" w:space="0" w:color="000000"/>
+              <w:right w:val="none" w:sz="0" w:space="0" w:color="000000"/>
+            </w:tcBorders>
+            <w:shd w:val="clear" w:color="auto" w:fill="FFFFFF"/>
+            <w:tcMar>
+              <w:top w:w="0" w:type="dxa"/>
+              <w:bottom w:w="0" w:type="dxa"/>
+              <w:left w:w="0" w:type="dxa"/>
+              <w:right w:w="0" w:type="dxa"/>
+            </w:tcMar>
+            <w:vAlign w:val="center"/>
+          </w:tcPr>
+          <w:p>
+            <w:pPr>
+              <w:pStyle w:val="Normal"/>
+              <w:jc w:val="left"/>
+              <w:pBdr>
+                <w:bottom w:val="none" w:sz="0" w:space="0" w:color="000000"/>
+                <w:top w:val="none" w:sz="0" w:space="0" w:color="000000"/>
+                <w:left w:val="none" w:sz="0" w:space="0" w:color="000000"/>
+                <w:right w:val="none" w:sz="0" w:space="0" w:color="000000"/>
+              </w:pBdr>
+              <w:spacing w:after="100" w:before="100" w:line="240"/>
+              <w:ind w:left="100" w:right="100" w:firstLine="0" w:firstLineChars="0"/>
+              <w:rPr>
+                <w:rFonts w:ascii="Arial" w:hAnsi="Arial" w:eastAsia="Arial" w:cs="Arial"/>
+                <w:i w:val="false"/>
+                <w:b w:val="false"/>
+                <w:u w:val="none"/>
+                <w:sz w:val="22"/>
+                <w:szCs w:val="22"/>
+                <w:color w:val="000000"/>
+              </w:rPr>
+            </w:pPr>
+            <w:r>
+              <w:rPr>
+                <w:rFonts w:ascii="Arial" w:hAnsi="Arial" w:eastAsia="Arial" w:cs="Arial"/>
+                <w:i w:val="false"/>
+                <w:b w:val="false"/>
+                <w:u w:val="none"/>
+                <w:sz w:val="22"/>
+                <w:szCs w:val="22"/>
+                <w:color w:val="000000"/>
+              </w:rPr>
+              <w:t xml:space="preserve">stageP:scaledog_rate_scaledscaleEQFALSE</w:t>
+            </w:r>
+          </w:p>
+        </w:tc>
+        <w:tc>
+          <w:tcPr>
+            <w:tcBorders>
+              <w:bottom w:val="none" w:sz="0" w:space="0" w:color="000000"/>
+              <w:top w:val="none" w:sz="0" w:space="0" w:color="000000"/>
+              <w:left w:val="none" w:sz="0" w:space="0" w:color="000000"/>
+              <w:right w:val="none" w:sz="0" w:space="0" w:color="000000"/>
+            </w:tcBorders>
+            <w:shd w:val="clear" w:color="auto" w:fill="FFFFFF"/>
+            <w:tcMar>
+              <w:top w:w="0" w:type="dxa"/>
+              <w:bottom w:w="0" w:type="dxa"/>
+              <w:left w:w="0" w:type="dxa"/>
+              <w:right w:w="0" w:type="dxa"/>
+            </w:tcMar>
+            <w:vAlign w:val="center"/>
+          </w:tcPr>
+          <w:p>
+            <w:pPr>
+              <w:pStyle w:val="Normal"/>
+              <w:jc w:val="right"/>
+              <w:pBdr>
+                <w:bottom w:val="none" w:sz="0" w:space="0" w:color="000000"/>
+                <w:top w:val="none" w:sz="0" w:space="0" w:color="000000"/>
+                <w:left w:val="none" w:sz="0" w:space="0" w:color="000000"/>
+                <w:right w:val="none" w:sz="0" w:space="0" w:color="000000"/>
+              </w:pBdr>
+              <w:spacing w:after="100" w:before="100" w:line="240"/>
+              <w:ind w:left="100" w:right="100" w:firstLine="0" w:firstLineChars="0"/>
+              <w:rPr>
+                <w:rFonts w:ascii="Arial" w:hAnsi="Arial" w:eastAsia="Arial" w:cs="Arial"/>
+                <w:i w:val="false"/>
+                <w:b w:val="false"/>
+                <w:u w:val="none"/>
+                <w:sz w:val="22"/>
+                <w:szCs w:val="22"/>
+                <w:color w:val="000000"/>
+              </w:rPr>
+            </w:pPr>
+            <w:r>
+              <w:rPr>
+                <w:rFonts w:ascii="Arial" w:hAnsi="Arial" w:eastAsia="Arial" w:cs="Arial"/>
+                <w:i w:val="false"/>
+                <w:b w:val="false"/>
+                <w:u w:val="none"/>
+                <w:sz w:val="22"/>
+                <w:szCs w:val="22"/>
+                <w:color w:val="000000"/>
+              </w:rPr>
+              <w:t xml:space="preserve">-0.82</w:t>
+            </w:r>
+          </w:p>
+        </w:tc>
+        <w:tc>
+          <w:tcPr>
+            <w:tcBorders>
+              <w:bottom w:val="none" w:sz="0" w:space="0" w:color="000000"/>
+              <w:top w:val="none" w:sz="0" w:space="0" w:color="000000"/>
+              <w:left w:val="none" w:sz="0" w:space="0" w:color="000000"/>
+              <w:right w:val="none" w:sz="0" w:space="0" w:color="000000"/>
+            </w:tcBorders>
+            <w:shd w:val="clear" w:color="auto" w:fill="FFFFFF"/>
+            <w:tcMar>
+              <w:top w:w="0" w:type="dxa"/>
+              <w:bottom w:w="0" w:type="dxa"/>
+              <w:left w:w="0" w:type="dxa"/>
+              <w:right w:w="0" w:type="dxa"/>
+            </w:tcMar>
+            <w:vAlign w:val="center"/>
+          </w:tcPr>
+          <w:p>
+            <w:pPr>
+              <w:pStyle w:val="Normal"/>
+              <w:jc w:val="right"/>
+              <w:pBdr>
+                <w:bottom w:val="none" w:sz="0" w:space="0" w:color="000000"/>
+                <w:top w:val="none" w:sz="0" w:space="0" w:color="000000"/>
+                <w:left w:val="none" w:sz="0" w:space="0" w:color="000000"/>
+                <w:right w:val="none" w:sz="0" w:space="0" w:color="000000"/>
+              </w:pBdr>
+              <w:spacing w:after="100" w:before="100" w:line="240"/>
+              <w:ind w:left="100" w:right="100" w:firstLine="0" w:firstLineChars="0"/>
+              <w:rPr>
+                <w:rFonts w:ascii="Arial" w:hAnsi="Arial" w:eastAsia="Arial" w:cs="Arial"/>
+                <w:i w:val="false"/>
+                <w:b w:val="false"/>
+                <w:u w:val="none"/>
+                <w:sz w:val="22"/>
+                <w:szCs w:val="22"/>
+                <w:color w:val="000000"/>
+              </w:rPr>
+            </w:pPr>
+            <w:r>
+              <w:rPr>
+                <w:rFonts w:ascii="Arial" w:hAnsi="Arial" w:eastAsia="Arial" w:cs="Arial"/>
+                <w:i w:val="false"/>
+                <w:b w:val="false"/>
+                <w:u w:val="none"/>
+                <w:sz w:val="22"/>
+                <w:szCs w:val="22"/>
+                <w:color w:val="000000"/>
+              </w:rPr>
+              <w:t xml:space="preserve">-1.25</w:t>
+            </w:r>
+          </w:p>
+        </w:tc>
+        <w:tc>
+          <w:tcPr>
+            <w:tcBorders>
+              <w:bottom w:val="none" w:sz="0" w:space="0" w:color="000000"/>
+              <w:top w:val="none" w:sz="0" w:space="0" w:color="000000"/>
+              <w:left w:val="none" w:sz="0" w:space="0" w:color="000000"/>
+              <w:right w:val="none" w:sz="0" w:space="0" w:color="000000"/>
+            </w:tcBorders>
+            <w:shd w:val="clear" w:color="auto" w:fill="FFFFFF"/>
+            <w:tcMar>
+              <w:top w:w="0" w:type="dxa"/>
+              <w:bottom w:w="0" w:type="dxa"/>
+              <w:left w:w="0" w:type="dxa"/>
+              <w:right w:w="0" w:type="dxa"/>
+            </w:tcMar>
+            <w:vAlign w:val="center"/>
+          </w:tcPr>
+          <w:p>
+            <w:pPr>
+              <w:pStyle w:val="Normal"/>
+              <w:jc w:val="right"/>
+              <w:pBdr>
+                <w:bottom w:val="none" w:sz="0" w:space="0" w:color="000000"/>
+                <w:top w:val="none" w:sz="0" w:space="0" w:color="000000"/>
+                <w:left w:val="none" w:sz="0" w:space="0" w:color="000000"/>
+                <w:right w:val="none" w:sz="0" w:space="0" w:color="000000"/>
+              </w:pBdr>
+              <w:spacing w:after="100" w:before="100" w:line="240"/>
+              <w:ind w:left="100" w:right="100" w:firstLine="0" w:firstLineChars="0"/>
+              <w:rPr>
+                <w:rFonts w:ascii="Arial" w:hAnsi="Arial" w:eastAsia="Arial" w:cs="Arial"/>
+                <w:i w:val="false"/>
+                <w:b w:val="false"/>
+                <w:u w:val="none"/>
+                <w:sz w:val="22"/>
+                <w:szCs w:val="22"/>
+                <w:color w:val="000000"/>
+              </w:rPr>
+            </w:pPr>
+            <w:r>
+              <w:rPr>
+                <w:rFonts w:ascii="Arial" w:hAnsi="Arial" w:eastAsia="Arial" w:cs="Arial"/>
+                <w:i w:val="false"/>
+                <w:b w:val="false"/>
+                <w:u w:val="none"/>
+                <w:sz w:val="22"/>
+                <w:szCs w:val="22"/>
+                <w:color w:val="000000"/>
+              </w:rPr>
+              <w:t xml:space="preserve">-0.38</w:t>
+            </w:r>
+          </w:p>
+        </w:tc>
+        <w:tc>
+          <w:tcPr>
+            <w:tcBorders>
+              <w:bottom w:val="none" w:sz="0" w:space="0" w:color="000000"/>
+              <w:top w:val="none" w:sz="0" w:space="0" w:color="000000"/>
+              <w:left w:val="none" w:sz="0" w:space="0" w:color="000000"/>
+              <w:right w:val="none" w:sz="0" w:space="0" w:color="000000"/>
+            </w:tcBorders>
+            <w:shd w:val="clear" w:color="auto" w:fill="FFFFFF"/>
+            <w:tcMar>
+              <w:top w:w="0" w:type="dxa"/>
+              <w:bottom w:w="0" w:type="dxa"/>
+              <w:left w:w="0" w:type="dxa"/>
+              <w:right w:w="0" w:type="dxa"/>
+            </w:tcMar>
+            <w:vAlign w:val="center"/>
+          </w:tcPr>
+          <w:p>
+            <w:pPr>
+              <w:pStyle w:val="Normal"/>
+              <w:jc w:val="right"/>
+              <w:pBdr>
+                <w:bottom w:val="none" w:sz="0" w:space="0" w:color="000000"/>
+                <w:top w:val="none" w:sz="0" w:space="0" w:color="000000"/>
+                <w:left w:val="none" w:sz="0" w:space="0" w:color="000000"/>
+                <w:right w:val="none" w:sz="0" w:space="0" w:color="000000"/>
+              </w:pBdr>
+              <w:spacing w:after="100" w:before="100" w:line="240"/>
+              <w:ind w:left="100" w:right="100" w:firstLine="0" w:firstLineChars="0"/>
+              <w:rPr>
+                <w:rFonts w:ascii="Arial" w:hAnsi="Arial" w:eastAsia="Arial" w:cs="Arial"/>
+                <w:i w:val="false"/>
+                <w:b w:val="false"/>
+                <w:u w:val="none"/>
+                <w:sz w:val="22"/>
+                <w:szCs w:val="22"/>
+                <w:color w:val="000000"/>
+              </w:rPr>
+            </w:pPr>
+            <w:r>
+              <w:rPr>
+                <w:rFonts w:ascii="Arial" w:hAnsi="Arial" w:eastAsia="Arial" w:cs="Arial"/>
+                <w:i w:val="false"/>
+                <w:b w:val="false"/>
+                <w:u w:val="none"/>
+                <w:sz w:val="22"/>
+                <w:szCs w:val="22"/>
+                <w:color w:val="000000"/>
+              </w:rPr>
+              <w:t xml:space="preserve">1</w:t>
+            </w:r>
+          </w:p>
+        </w:tc>
+      </w:tr>
+      <w:tr>
+        <w:trPr>
+          <w:trHeight w:val="360" w:hRule="auto"/>
+        </w:trPr>
+        body17
+        <w:tc>
+          <w:tcPr>
+            <w:tcBorders>
               <w:bottom w:val="single" w:sz="12" w:space="0" w:color="666666"/>
               <w:top w:val="none" w:sz="0" w:space="0" w:color="000000"/>
               <w:left w:val="none" w:sz="0" w:space="0" w:color="000000"/>
@@ -4406,7 +4677,7 @@
                 <w:szCs w:val="22"/>
                 <w:color w:val="000000"/>
               </w:rPr>
-              <w:t xml:space="preserve">stageP:scaledog_rate_scaledscaleEQFALSE</w:t>
+              <w:t xml:space="preserve">scalehuman_rate_scaledscaleEQFALSE:scaledog_rate_scaledscaleEQFALSE</w:t>
             </w:r>
           </w:p>
         </w:tc>
@@ -4459,7 +4730,7 @@
                 <w:szCs w:val="22"/>
                 <w:color w:val="000000"/>
               </w:rPr>
-              <w:t xml:space="preserve">-0.80</w:t>
+              <w:t xml:space="preserve">-0.51</w:t>
             </w:r>
           </w:p>
         </w:tc>
@@ -4512,7 +4783,7 @@
                 <w:szCs w:val="22"/>
                 <w:color w:val="000000"/>
               </w:rPr>
-              <w:t xml:space="preserve">-1.24</w:t>
+              <w:t xml:space="preserve">-0.87</w:t>
             </w:r>
           </w:p>
         </w:tc>
@@ -4565,7 +4836,7 @@
                 <w:szCs w:val="22"/>
                 <w:color w:val="000000"/>
               </w:rPr>
-              <w:t xml:space="preserve">-0.36</w:t>
+              <w:t xml:space="preserve">-0.17</w:t>
             </w:r>
           </w:p>
         </w:tc>

</xml_diff>